<commit_message>
Fix batch 15 agreement questionnaire guidance and owner instructions
</commit_message>
<xml_diff>
--- a/docs/word/FPSLLC Operating Agreement Instructions - DRAFT.docx
+++ b/docs/word/FPSLLC Operating Agreement Instructions - DRAFT.docx
@@ -854,6 +854,23 @@
           <w:sz w:val="24"/>
           <w:szCs w:val="24"/>
         </w:rPr>
+        <w:t xml:space="preserve">[MANAGER NAMES]</w:t>
+      </w:r>
+      <w:r>
+        <w:rPr>
+          <w:rFonts w:ascii="Times New Roman" w:hAnsi="Times New Roman"/>
+          <w:sz w:val="24"/>
+          <w:szCs w:val="24"/>
+        </w:rPr>
+        <w:t xml:space="preserve"> (manager-managed forms only) — the initial manager or managers in the appointment. </w:t>
+      </w:r>
+      <w:r>
+        <w:rPr>
+          <w:rFonts w:ascii="Times New Roman" w:hAnsi="Times New Roman"/>
+          <w:b/>
+          <w:sz w:val="24"/>
+          <w:szCs w:val="24"/>
+        </w:rPr>
         <w:t xml:space="preserve">[MANAGER NAME]</w:t>
       </w:r>
       <w:r>
@@ -862,7 +879,7 @@
           <w:sz w:val="24"/>
           <w:szCs w:val="24"/>
         </w:rPr>
-        <w:t xml:space="preserve"> (manager-managed forms only) — the manager. The manager does not have to be an owner. The member-managed forms have no manager: the members manage directly, and in the member-managed forms with more than one owner, one of them is designated Administrative Member under §5.8 to handle ministerial tasks, with no authority to decide anything on the members' behalf.</w:t>
+        <w:t xml:space="preserve"> — the manager identified in each manager signature block. The manager does not have to be an owner. The member-managed forms have no manager: the members manage directly, and in the member-managed forms with more than one owner, one of them is designated Administrative Member under §5.8 to handle ministerial tasks. The Administrative Member also has any additional authority expressly granted by the agreement or by owners holding a Majority in Interest; the role does not make that person a manager.</w:t>
       </w:r>
     </w:p>
     <w:p>
@@ -910,7 +927,7 @@
           <w:sz w:val="24"/>
           <w:szCs w:val="24"/>
         </w:rPr>
-        <w:t xml:space="preserve"> (multi-member forms: §5.4(f) manager-managed, §5.5(f) member-managed) — the dollar amount of debt that may be incurred without the written consent of every owner: by the manager in the manager-managed forms, by any member acting alone in the member-managed forms. Above this number, any one owner can refuse. Common choices: $10,000–$50,000 for small companies.</w:t>
+        <w:t xml:space="preserve"> (multi-member forms: §5.4(f) manager-managed, §5.5(f) member-managed) — the dollar amount of debt that may be incurred without the consent of every owner: by the manager in the manager-managed forms, by any member acting alone in the member-managed forms. Above this number, any one owner can refuse. A guarantee of anyone's obligation requires every owner's consent regardless of amount. A guarantee of one series' obligations by another series or by the company also requires the express written instrument specified in the agreement. Common choices: $10,000–$50,000 for small companies.</w:t>
       </w:r>
     </w:p>
     <w:p>
@@ -1644,7 +1661,7 @@
           <w:sz w:val="24"/>
           <w:szCs w:val="24"/>
         </w:rPr>
-        <w:t xml:space="preserve"> If included, a majority of owners can require everyone to chip in more money (pro rata), up to the annual per-member </w:t>
+        <w:t xml:space="preserve"> If included, owners holding more than 50% of the ownership interests held by members can require everyone to chip in more money (pro rata), up to the annual per-member </w:t>
       </w:r>
       <w:r>
         <w:rPr>
@@ -1743,7 +1760,7 @@
           <w:sz w:val="24"/>
           <w:szCs w:val="24"/>
         </w:rPr>
-        <w:t xml:space="preserve"> For companies that can split 50/50 (two equal owners, or two equal factions), a deadlock otherwise has no exit short of a lawsuit to dissolve the company. The shotgun works like cutting a cake: after a 60-day deadlock, either substantial owner may name a single price for the whole company; the </w:t>
+        <w:t xml:space="preserve"> A company can deadlock with equal or unequal ownership: a majority cannot override a decision requiring unanimous approval. Section 13.2 covers a failure to obtain the required vote to approve or reject a matter that continues for 60 days after written notice of the deadlock. It excludes matters requiring every member's consent where the Act expressly permits a member to withhold that consent. If you include it, an owner holding at least 25% may offer a single cash valuation for the company and all its series; the </w:t>
       </w:r>
       <w:r>
         <w:rPr>
@@ -1760,24 +1777,7 @@
           <w:sz w:val="24"/>
           <w:szCs w:val="24"/>
         </w:rPr>
-        <w:t xml:space="preserve"> side then chooses whether to buy or sell at that price. Naming the price honestly is self-enforcing — name it too low and you get bought out cheap; too high and you overpay. </w:t>
-      </w:r>
-      <w:r>
-        <w:rPr>
-          <w:rFonts w:ascii="Times New Roman" w:hAnsi="Times New Roman"/>
-          <w:b/>
-          <w:sz w:val="24"/>
-          <w:szCs w:val="24"/>
-        </w:rPr>
-        <w:t xml:space="preserve">Caution:</w:t>
-      </w:r>
-      <w:r>
-        <w:rPr>
-          <w:rFonts w:ascii="Times New Roman" w:hAnsi="Times New Roman"/>
-          <w:sz w:val="24"/>
-          <w:szCs w:val="24"/>
-        </w:rPr>
-        <w:t xml:space="preserve"> the mechanism favors the owner with more cash, since the poorer side may be forced to sell even at a fair price. To omit it, replace the text of §13.2 with "[Reserved.]". Omit it if ownership is not evenly split (a majority can always outvote a deadlock) or if the owners' finances are badly mismatched.</w:t>
+        <w:t xml:space="preserve"> owners then choose to buy the offering owner's interest or sell their own at their proportionate shares of that valuation. The mechanism can favor an owner with greater access to cash. Without an agreed exit mechanism, owners may need to negotiate a solution or ask a court for relief. To omit it, replace the text of §13.2 with "[Reserved.]". Unequal ownership alone is not a reason to omit it; consider the covered decisions and the owners' ability to fund a buyout.</w:t>
       </w:r>
     </w:p>
     <w:p>
@@ -1826,7 +1826,7 @@
           <w:sz w:val="24"/>
           <w:szCs w:val="24"/>
         </w:rPr>
-        <w:t xml:space="preserve"> obtaining the written consent of a Majority in Interest of the other members — death does not bypass the same controls that govern lifetime transfers.</w:t>
+        <w:t xml:space="preserve"> obtaining the written consent of a Majority in Interest of the other members — the same admission threshold applies to a permitted family transferee, excluding the transferring owner; other new members need every member's written consent and a signed agreement to be bound. Permission to transfer an interest is separate from admission as a voting member.</w:t>
       </w:r>
     </w:p>
     <w:p>

</xml_diff>